<commit_message>
OTC: Section header → 'Section 2 — Trading Activities'; drop intro para
Co-Authored-By: Claude Opus 4.7 <noreply@anthropic.com>
</commit_message>
<xml_diff>
--- a/mockup/monthly_client_statement/sample-statements/OTCTrading_Detailed_sample.docx
+++ b/mockup/monthly_client_statement/sample-statements/OTCTrading_Detailed_sample.docx
@@ -884,7 +884,7 @@
                 <w:color w:val="0A2342"/>
                 <w:sz w:val="44"/>
               </w:rPr>
-              <w:t>Section 3 — OTC Trading (Detailed View)</w:t>
+              <w:t>Section 2 — Trading Activities</w:t>
             </w:r>
           </w:p>
         </w:tc>
@@ -947,22 +947,6 @@
       <w:pPr>
         <w:spacing w:after="120"/>
       </w:pPr>
-    </w:p>
-    <w:p>
-      <w:pPr>
-        <w:spacing w:before="0" w:after="120"/>
-      </w:pPr>
-      <w:r>
-        <w:rPr>
-          <w:rFonts w:ascii="Arial" w:hAnsi="Arial"/>
-          <w:rFonts w:ascii="Arial" w:hAnsi="Arial" w:cs="Arial"/>
-          <w:b w:val="0"/>
-          <w:i w:val="0"/>
-          <w:color w:val="4A5568"/>
-          <w:sz w:val="18"/>
-        </w:rPr>
-        <w:t>Full list of OTC trades and their settlement asset movements. Settlement entries (Section B) are the same Market Settlement-In / Market Settlement-Out events recorded in the Custody section, presented here with explicit Trade ID linkage for reconciliation. Unsettled trades produce no entries in Section B until they settle.</w:t>
-      </w:r>
     </w:p>
     <w:p>
       <w:pPr>

</xml_diff>

<commit_message>
OTC Detailed: drop Settlement Movements intro paragraph
Co-Authored-By: Claude Opus 4.7 <noreply@anthropic.com>
</commit_message>
<xml_diff>
--- a/mockup/monthly_client_statement/sample-statements/OTCTrading_Detailed_sample.docx
+++ b/mockup/monthly_client_statement/sample-statements/OTCTrading_Detailed_sample.docx
@@ -5350,22 +5350,6 @@
           <w:sz w:val="28"/>
         </w:rPr>
         <w:t>B. Settlement Movements</w:t>
-      </w:r>
-    </w:p>
-    <w:p>
-      <w:pPr>
-        <w:spacing w:before="0" w:after="120"/>
-      </w:pPr>
-      <w:r>
-        <w:rPr>
-          <w:rFonts w:ascii="Arial" w:hAnsi="Arial"/>
-          <w:rFonts w:ascii="Arial" w:hAnsi="Arial" w:cs="Arial"/>
-          <w:b w:val="0"/>
-          <w:i w:val="0"/>
-          <w:color w:val="4A5568"/>
-          <w:sz w:val="18"/>
-        </w:rPr>
-        <w:t>Two rows per settled OTC trade — one Received (in) leg and one Paid (out) leg, linked to the trade above by Trade ID.</w:t>
       </w:r>
     </w:p>
     <w:tbl>

</xml_diff>

<commit_message>
Settlement Movements: drop Total row
Co-Authored-By: Claude Opus 4.7 <noreply@anthropic.com>
</commit_message>
<xml_diff>
--- a/mockup/monthly_client_statement/sample-statements/OTCTrading_Detailed_sample.docx
+++ b/mockup/monthly_client_statement/sample-statements/OTCTrading_Detailed_sample.docx
@@ -16741,213 +16741,6 @@
                 <w:sz w:val="13"/>
               </w:rPr>
               <w:t>0x24564dd0d34fecb30ea5f9ca13f5a4ddee7a063cee3a837ccfb65227ccec3b7d</w:t>
-            </w:r>
-          </w:p>
-        </w:tc>
-      </w:tr>
-      <w:tr>
-        <w:tc>
-          <w:tcPr>
-            <w:tcW w:type="dxa" w:w="907"/>
-            <w:shd w:val="clear" w:color="auto" w:fill="E5EBF1"/>
-            <w:tcBorders>
-              <w:bottom w:val="single" w:sz="4" w:color="D0D5DD"/>
-            </w:tcBorders>
-            <w:vAlign w:val="center"/>
-          </w:tcPr>
-          <w:p>
-            <w:pPr>
-              <w:spacing w:before="40" w:after="40"/>
-            </w:pPr>
-            <w:r>
-              <w:rPr>
-                <w:rFonts w:ascii="Arial" w:hAnsi="Arial"/>
-                <w:rFonts w:ascii="Arial" w:hAnsi="Arial" w:cs="Arial"/>
-                <w:b/>
-                <w:i w:val="0"/>
-                <w:color w:val="0A2342"/>
-                <w:sz w:val="13"/>
-              </w:rPr>
-              <w:t>Total (22 settled · 44 movements)</w:t>
-            </w:r>
-          </w:p>
-        </w:tc>
-        <w:tc>
-          <w:tcPr>
-            <w:tcW w:type="dxa" w:w="1020"/>
-            <w:shd w:val="clear" w:color="auto" w:fill="E5EBF1"/>
-            <w:tcBorders>
-              <w:bottom w:val="single" w:sz="4" w:color="D0D5DD"/>
-            </w:tcBorders>
-            <w:vAlign w:val="center"/>
-          </w:tcPr>
-          <w:p>
-            <w:pPr>
-              <w:spacing w:before="40" w:after="40"/>
-            </w:pPr>
-            <w:r>
-              <w:rPr>
-                <w:rFonts w:ascii="Arial" w:hAnsi="Arial"/>
-                <w:rFonts w:ascii="Arial" w:hAnsi="Arial" w:cs="Arial"/>
-                <w:b/>
-                <w:i w:val="0"/>
-                <w:color w:val="0A2342"/>
-                <w:sz w:val="13"/>
-              </w:rPr>
-            </w:r>
-          </w:p>
-        </w:tc>
-        <w:tc>
-          <w:tcPr>
-            <w:tcW w:type="dxa" w:w="1134"/>
-            <w:shd w:val="clear" w:color="auto" w:fill="E5EBF1"/>
-            <w:tcBorders>
-              <w:bottom w:val="single" w:sz="4" w:color="D0D5DD"/>
-            </w:tcBorders>
-            <w:vAlign w:val="center"/>
-          </w:tcPr>
-          <w:p>
-            <w:pPr>
-              <w:spacing w:before="40" w:after="40"/>
-            </w:pPr>
-            <w:r>
-              <w:rPr>
-                <w:rFonts w:ascii="Arial" w:hAnsi="Arial"/>
-                <w:rFonts w:ascii="Arial" w:hAnsi="Arial" w:cs="Arial"/>
-                <w:b/>
-                <w:i w:val="0"/>
-                <w:color w:val="0A2342"/>
-                <w:sz w:val="13"/>
-              </w:rPr>
-            </w:r>
-          </w:p>
-        </w:tc>
-        <w:tc>
-          <w:tcPr>
-            <w:tcW w:type="dxa" w:w="680"/>
-            <w:shd w:val="clear" w:color="auto" w:fill="E5EBF1"/>
-            <w:tcBorders>
-              <w:bottom w:val="single" w:sz="4" w:color="D0D5DD"/>
-            </w:tcBorders>
-            <w:vAlign w:val="center"/>
-          </w:tcPr>
-          <w:p>
-            <w:pPr>
-              <w:spacing w:before="40" w:after="40"/>
-            </w:pPr>
-            <w:r>
-              <w:rPr>
-                <w:rFonts w:ascii="Arial" w:hAnsi="Arial"/>
-                <w:rFonts w:ascii="Arial" w:hAnsi="Arial" w:cs="Arial"/>
-                <w:b/>
-                <w:i w:val="0"/>
-                <w:color w:val="0A2342"/>
-                <w:sz w:val="13"/>
-              </w:rPr>
-            </w:r>
-          </w:p>
-        </w:tc>
-        <w:tc>
-          <w:tcPr>
-            <w:tcW w:type="dxa" w:w="1020"/>
-            <w:shd w:val="clear" w:color="auto" w:fill="E5EBF1"/>
-            <w:tcBorders>
-              <w:bottom w:val="single" w:sz="4" w:color="D0D5DD"/>
-            </w:tcBorders>
-            <w:vAlign w:val="center"/>
-          </w:tcPr>
-          <w:p>
-            <w:pPr>
-              <w:spacing w:before="40" w:after="40"/>
-            </w:pPr>
-            <w:r>
-              <w:rPr>
-                <w:rFonts w:ascii="Arial" w:hAnsi="Arial"/>
-                <w:rFonts w:ascii="Arial" w:hAnsi="Arial" w:cs="Arial"/>
-                <w:b/>
-                <w:i w:val="0"/>
-                <w:color w:val="0A2342"/>
-                <w:sz w:val="13"/>
-              </w:rPr>
-            </w:r>
-          </w:p>
-        </w:tc>
-        <w:tc>
-          <w:tcPr>
-            <w:tcW w:type="dxa" w:w="1134"/>
-            <w:shd w:val="clear" w:color="auto" w:fill="E5EBF1"/>
-            <w:tcBorders>
-              <w:bottom w:val="single" w:sz="4" w:color="D0D5DD"/>
-            </w:tcBorders>
-            <w:vAlign w:val="center"/>
-          </w:tcPr>
-          <w:p>
-            <w:pPr>
-              <w:spacing w:before="40" w:after="40"/>
-              <w:jc w:val="right"/>
-            </w:pPr>
-            <w:r>
-              <w:rPr>
-                <w:rFonts w:ascii="Arial" w:hAnsi="Arial"/>
-                <w:rFonts w:ascii="Arial" w:hAnsi="Arial" w:cs="Arial"/>
-                <w:b/>
-                <w:i w:val="0"/>
-                <w:color w:val="0A2342"/>
-                <w:sz w:val="13"/>
-              </w:rPr>
-            </w:r>
-          </w:p>
-        </w:tc>
-        <w:tc>
-          <w:tcPr>
-            <w:tcW w:type="dxa" w:w="1134"/>
-            <w:shd w:val="clear" w:color="auto" w:fill="E5EBF1"/>
-            <w:tcBorders>
-              <w:bottom w:val="single" w:sz="4" w:color="D0D5DD"/>
-            </w:tcBorders>
-            <w:vAlign w:val="center"/>
-          </w:tcPr>
-          <w:p>
-            <w:pPr>
-              <w:spacing w:before="40" w:after="40"/>
-              <w:jc w:val="right"/>
-            </w:pPr>
-            <w:r>
-              <w:rPr>
-                <w:rFonts w:ascii="Arial" w:hAnsi="Arial"/>
-                <w:rFonts w:ascii="Arial" w:hAnsi="Arial" w:cs="Arial"/>
-                <w:b/>
-                <w:i w:val="0"/>
-                <w:color w:val="0A2342"/>
-                <w:sz w:val="13"/>
-              </w:rPr>
-              <w:t>—</w:t>
-            </w:r>
-          </w:p>
-        </w:tc>
-        <w:tc>
-          <w:tcPr>
-            <w:tcW w:type="dxa" w:w="3175"/>
-            <w:shd w:val="clear" w:color="auto" w:fill="E5EBF1"/>
-            <w:tcBorders>
-              <w:bottom w:val="single" w:sz="4" w:color="D0D5DD"/>
-            </w:tcBorders>
-            <w:vAlign w:val="center"/>
-          </w:tcPr>
-          <w:p>
-            <w:pPr>
-              <w:spacing w:before="40" w:after="40"/>
-              <w:jc w:val="right"/>
-            </w:pPr>
-            <w:r>
-              <w:rPr>
-                <w:rFonts w:ascii="Arial" w:hAnsi="Arial"/>
-                <w:rFonts w:ascii="Arial" w:hAnsi="Arial" w:cs="Arial"/>
-                <w:b/>
-                <w:i w:val="0"/>
-                <w:color w:val="0A2342"/>
-                <w:sz w:val="13"/>
-              </w:rPr>
             </w:r>
           </w:p>
         </w:tc>

</xml_diff>